<commit_message>
update links and resume
</commit_message>
<xml_diff>
--- a/MatthewMeents.docx
+++ b/MatthewMeents.docx
@@ -827,6 +827,13 @@
     </w:p>
     <w:p>
       <w:pPr>
+        <w:pStyle w:val="ListParagraph"/>
+        <w:spacing w:after="40"/>
+        <w:ind w:left="480"/>
+      </w:pPr>
+    </w:p>
+    <w:p>
+      <w:pPr>
         <w:tabs>
           <w:tab w:val="right" w:pos="9026"/>
         </w:tabs>
@@ -842,31 +849,86 @@
           <w:szCs w:val="22"/>
         </w:rPr>
         <w:lastRenderedPageBreak/>
-        <w:t xml:space="preserve">ALM </w:t>
-      </w:r>
-      <w:proofErr w:type="gramStart"/>
-      <w:r>
-        <w:rPr>
-          <w:rFonts w:ascii="Arial" w:eastAsia="Arial" w:hAnsi="Arial" w:cs="Arial"/>
-          <w:b/>
-          <w:bCs/>
-          <w:color w:val="1A1A2E"/>
-          <w:sz w:val="22"/>
-          <w:szCs w:val="22"/>
-        </w:rPr>
-        <w:t>Media  /</w:t>
-      </w:r>
-      <w:proofErr w:type="gramEnd"/>
-      <w:r>
-        <w:rPr>
-          <w:rFonts w:ascii="Arial" w:eastAsia="Arial" w:hAnsi="Arial" w:cs="Arial"/>
-          <w:b/>
-          <w:bCs/>
-          <w:color w:val="1A1A2E"/>
-          <w:sz w:val="22"/>
-          <w:szCs w:val="22"/>
-        </w:rPr>
-        <w:t xml:space="preserve">  IBM (via acquisition)</w:t>
+        <w:t>AL</w:t>
+      </w:r>
+      <w:bookmarkStart w:id="0" w:name="_GoBack"/>
+      <w:bookmarkEnd w:id="0"/>
+      <w:r>
+        <w:rPr>
+          <w:rFonts w:ascii="Arial" w:eastAsia="Arial" w:hAnsi="Arial" w:cs="Arial"/>
+          <w:b/>
+          <w:bCs/>
+          <w:color w:val="1A1A2E"/>
+          <w:sz w:val="22"/>
+          <w:szCs w:val="22"/>
+        </w:rPr>
+        <w:t>M Media</w:t>
+      </w:r>
+      <w:r>
+        <w:rPr>
+          <w:rFonts w:ascii="Arial" w:eastAsia="Arial" w:hAnsi="Arial" w:cs="Arial"/>
+          <w:b/>
+          <w:bCs/>
+          <w:color w:val="1A1A2E"/>
+          <w:sz w:val="22"/>
+          <w:szCs w:val="22"/>
+        </w:rPr>
+        <w:t>,</w:t>
+      </w:r>
+      <w:r>
+        <w:rPr>
+          <w:rFonts w:ascii="Arial" w:eastAsia="Arial" w:hAnsi="Arial" w:cs="Arial"/>
+          <w:b/>
+          <w:bCs/>
+          <w:color w:val="1A1A2E"/>
+          <w:sz w:val="22"/>
+          <w:szCs w:val="22"/>
+        </w:rPr>
+        <w:t xml:space="preserve"> </w:t>
+      </w:r>
+      <w:r>
+        <w:rPr>
+          <w:rFonts w:ascii="Arial" w:eastAsia="Arial" w:hAnsi="Arial" w:cs="Arial"/>
+          <w:b/>
+          <w:bCs/>
+          <w:color w:val="1A1A2E"/>
+          <w:sz w:val="22"/>
+          <w:szCs w:val="22"/>
+        </w:rPr>
+        <w:t>Kenexa</w:t>
+      </w:r>
+      <w:r>
+        <w:rPr>
+          <w:rFonts w:ascii="Arial" w:eastAsia="Arial" w:hAnsi="Arial" w:cs="Arial"/>
+          <w:b/>
+          <w:bCs/>
+          <w:color w:val="1A1A2E"/>
+          <w:sz w:val="22"/>
+          <w:szCs w:val="22"/>
+        </w:rPr>
+        <w:t xml:space="preserve"> </w:t>
+      </w:r>
+      <w:r>
+        <w:rPr>
+          <w:rFonts w:ascii="Arial" w:eastAsia="Arial" w:hAnsi="Arial" w:cs="Arial"/>
+          <w:b/>
+          <w:bCs/>
+          <w:color w:val="1A1A2E"/>
+          <w:sz w:val="22"/>
+          <w:szCs w:val="22"/>
+        </w:rPr>
+        <w:t>(</w:t>
+      </w:r>
+      <w:r>
+        <w:rPr>
+          <w:rFonts w:ascii="Arial" w:eastAsia="Arial" w:hAnsi="Arial" w:cs="Arial"/>
+          <w:b/>
+          <w:bCs/>
+          <w:color w:val="1A1A2E"/>
+          <w:sz w:val="22"/>
+          <w:szCs w:val="22"/>
+        </w:rPr>
+        <w:t>IBM via acquisition)</w:t>
       </w:r>
       <w:r>
         <w:rPr>
@@ -907,7 +969,6 @@
       <w:pPr>
         <w:spacing w:after="60"/>
       </w:pPr>
-      <w:bookmarkStart w:id="0" w:name="_GoBack"/>
       <w:r>
         <w:rPr>
           <w:rFonts w:ascii="Arial" w:eastAsia="Arial" w:hAnsi="Arial" w:cs="Arial"/>
@@ -920,7 +981,6 @@
         <w:t>Full-stack development across legal case management (C#, MS SQL) and HR platform products (Delphi, VBScript, MS SQL).</w:t>
       </w:r>
     </w:p>
-    <w:bookmarkEnd w:id="0"/>
     <w:p>
       <w:pPr>
         <w:pBdr>
@@ -1188,6 +1248,230 @@
           <w:szCs w:val="22"/>
         </w:rPr>
         <w:t>OPEN SOURCE PROJECTS</w:t>
+      </w:r>
+    </w:p>
+    <w:p>
+      <w:pPr>
+        <w:pStyle w:val="ListParagraph"/>
+        <w:numPr>
+          <w:ilvl w:val="0"/>
+          <w:numId w:val="2"/>
+        </w:numPr>
+        <w:spacing w:after="40"/>
+        <w:rPr>
+          <w:rFonts w:ascii="Arial" w:hAnsi="Arial" w:cs="Arial"/>
+          <w:b/>
+        </w:rPr>
+      </w:pPr>
+      <w:proofErr w:type="spellStart"/>
+      <w:r>
+        <w:rPr>
+          <w:rFonts w:ascii="Arial" w:hAnsi="Arial" w:cs="Arial"/>
+          <w:b/>
+        </w:rPr>
+        <w:t>WeaversGuild</w:t>
+      </w:r>
+      <w:proofErr w:type="spellEnd"/>
+      <w:r>
+        <w:rPr>
+          <w:rFonts w:ascii="Arial" w:hAnsi="Arial" w:cs="Arial"/>
+          <w:b/>
+        </w:rPr>
+        <w:t xml:space="preserve"> </w:t>
+      </w:r>
+      <w:r>
+        <w:rPr>
+          <w:rFonts w:ascii="Arial" w:eastAsia="Arial" w:hAnsi="Arial" w:cs="Arial"/>
+          <w:color w:val="1A1A2E"/>
+        </w:rPr>
+        <w:t>—</w:t>
+      </w:r>
+      <w:r>
+        <w:rPr>
+          <w:rFonts w:ascii="Arial" w:eastAsia="Arial" w:hAnsi="Arial" w:cs="Arial"/>
+          <w:color w:val="1A1A2E"/>
+        </w:rPr>
+        <w:t xml:space="preserve"> LLM toolset App, </w:t>
+      </w:r>
+      <w:proofErr w:type="spellStart"/>
+      <w:proofErr w:type="gramStart"/>
+      <w:r>
+        <w:rPr>
+          <w:rFonts w:ascii="Arial" w:eastAsia="Arial" w:hAnsi="Arial" w:cs="Arial"/>
+          <w:color w:val="1A1A2E"/>
+        </w:rPr>
+        <w:t>Api</w:t>
+      </w:r>
+      <w:proofErr w:type="spellEnd"/>
+      <w:proofErr w:type="gramEnd"/>
+      <w:r>
+        <w:rPr>
+          <w:rFonts w:ascii="Arial" w:eastAsia="Arial" w:hAnsi="Arial" w:cs="Arial"/>
+          <w:color w:val="1A1A2E"/>
+        </w:rPr>
+        <w:t xml:space="preserve">, MCP, similar to Storytime but is oriented towards C# and EF Core, following </w:t>
+      </w:r>
+      <w:proofErr w:type="spellStart"/>
+      <w:r>
+        <w:rPr>
+          <w:rFonts w:ascii="Arial" w:eastAsia="Arial" w:hAnsi="Arial" w:cs="Arial"/>
+          <w:color w:val="1A1A2E"/>
+        </w:rPr>
+        <w:t>Storytimes</w:t>
+      </w:r>
+      <w:proofErr w:type="spellEnd"/>
+      <w:r>
+        <w:rPr>
+          <w:rFonts w:ascii="Arial" w:eastAsia="Arial" w:hAnsi="Arial" w:cs="Arial"/>
+          <w:color w:val="1A1A2E"/>
+        </w:rPr>
+        <w:t>’ principals, Structured Agent</w:t>
+      </w:r>
+      <w:r>
+        <w:rPr>
+          <w:rFonts w:ascii="Arial" w:eastAsia="Arial" w:hAnsi="Arial" w:cs="Arial"/>
+          <w:color w:val="1A1A2E"/>
+        </w:rPr>
+        <w:t>s</w:t>
+      </w:r>
+      <w:r>
+        <w:rPr>
+          <w:rFonts w:ascii="Arial" w:eastAsia="Arial" w:hAnsi="Arial" w:cs="Arial"/>
+          <w:color w:val="1A1A2E"/>
+        </w:rPr>
+        <w:t xml:space="preserve"> building</w:t>
+      </w:r>
+      <w:r>
+        <w:rPr>
+          <w:rFonts w:ascii="Arial" w:eastAsia="Arial" w:hAnsi="Arial" w:cs="Arial"/>
+          <w:color w:val="1A1A2E"/>
+        </w:rPr>
+        <w:t xml:space="preserve"> out libraries of EF Core databases so far. </w:t>
+      </w:r>
+      <w:r>
+        <w:rPr>
+          <w:rFonts w:ascii="Arial" w:eastAsia="Arial" w:hAnsi="Arial" w:cs="Arial"/>
+          <w:color w:val="2E5BFF"/>
+        </w:rPr>
+        <w:t>github.com/mmeents/</w:t>
+      </w:r>
+      <w:proofErr w:type="spellStart"/>
+      <w:r>
+        <w:rPr>
+          <w:rFonts w:ascii="Arial" w:eastAsia="Arial" w:hAnsi="Arial" w:cs="Arial"/>
+          <w:color w:val="2E5BFF"/>
+        </w:rPr>
+        <w:t>WeaversGuild</w:t>
+      </w:r>
+      <w:proofErr w:type="spellEnd"/>
+      <w:r>
+        <w:rPr>
+          <w:rFonts w:ascii="Arial" w:eastAsia="Arial" w:hAnsi="Arial" w:cs="Arial"/>
+          <w:color w:val="1A1A2E"/>
+        </w:rPr>
+        <w:t xml:space="preserve"> </w:t>
+      </w:r>
+      <w:r>
+        <w:rPr>
+          <w:rFonts w:ascii="Arial" w:eastAsia="Arial" w:hAnsi="Arial" w:cs="Arial"/>
+          <w:color w:val="1A1A2E"/>
+        </w:rPr>
+        <w:t xml:space="preserve"> </w:t>
+      </w:r>
+    </w:p>
+    <w:p>
+      <w:pPr>
+        <w:pStyle w:val="ListParagraph"/>
+        <w:numPr>
+          <w:ilvl w:val="0"/>
+          <w:numId w:val="2"/>
+        </w:numPr>
+        <w:spacing w:after="40"/>
+        <w:rPr>
+          <w:rFonts w:ascii="Arial" w:hAnsi="Arial" w:cs="Arial"/>
+          <w:b/>
+        </w:rPr>
+      </w:pPr>
+      <w:r>
+        <w:rPr>
+          <w:rFonts w:ascii="Arial" w:hAnsi="Arial" w:cs="Arial"/>
+          <w:b/>
+        </w:rPr>
+        <w:t xml:space="preserve">Storytime </w:t>
+      </w:r>
+      <w:r>
+        <w:rPr>
+          <w:rFonts w:ascii="Arial" w:eastAsia="Arial" w:hAnsi="Arial" w:cs="Arial"/>
+          <w:color w:val="1A1A2E"/>
+        </w:rPr>
+        <w:t>—</w:t>
+      </w:r>
+      <w:r>
+        <w:rPr>
+          <w:rFonts w:ascii="Arial" w:eastAsia="Arial" w:hAnsi="Arial" w:cs="Arial"/>
+          <w:color w:val="1A1A2E"/>
+        </w:rPr>
+        <w:t xml:space="preserve"> LLM tool set, App, </w:t>
+      </w:r>
+      <w:proofErr w:type="spellStart"/>
+      <w:r>
+        <w:rPr>
+          <w:rFonts w:ascii="Arial" w:eastAsia="Arial" w:hAnsi="Arial" w:cs="Arial"/>
+          <w:color w:val="1A1A2E"/>
+        </w:rPr>
+        <w:t>Api</w:t>
+      </w:r>
+      <w:proofErr w:type="spellEnd"/>
+      <w:r>
+        <w:rPr>
+          <w:rFonts w:ascii="Arial" w:eastAsia="Arial" w:hAnsi="Arial" w:cs="Arial"/>
+          <w:color w:val="1A1A2E"/>
+        </w:rPr>
+        <w:t>, MCP;</w:t>
+      </w:r>
+      <w:r>
+        <w:rPr>
+          <w:rFonts w:ascii="Arial" w:eastAsia="Arial" w:hAnsi="Arial" w:cs="Arial"/>
+          <w:color w:val="1A1A2E"/>
+        </w:rPr>
+        <w:t xml:space="preserve"> targeting </w:t>
+      </w:r>
+      <w:proofErr w:type="spellStart"/>
+      <w:r>
+        <w:rPr>
+          <w:rFonts w:ascii="Arial" w:eastAsia="Arial" w:hAnsi="Arial" w:cs="Arial"/>
+          <w:color w:val="1A1A2E"/>
+        </w:rPr>
+        <w:t>Anthropic’s</w:t>
+      </w:r>
+      <w:proofErr w:type="spellEnd"/>
+      <w:r>
+        <w:rPr>
+          <w:rFonts w:ascii="Arial" w:eastAsia="Arial" w:hAnsi="Arial" w:cs="Arial"/>
+          <w:color w:val="1A1A2E"/>
+        </w:rPr>
+        <w:t xml:space="preserve"> Claude and LM Studio(local models)</w:t>
+      </w:r>
+      <w:r>
+        <w:rPr>
+          <w:rFonts w:ascii="Arial" w:eastAsia="Arial" w:hAnsi="Arial" w:cs="Arial"/>
+          <w:color w:val="1A1A2E"/>
+        </w:rPr>
+        <w:t xml:space="preserve"> focus is structured schedulable agents writing scenes and stories as a production organization. </w:t>
+      </w:r>
+      <w:r>
+        <w:rPr>
+          <w:rFonts w:ascii="Arial" w:eastAsia="Arial" w:hAnsi="Arial" w:cs="Arial"/>
+          <w:color w:val="2E5BFF"/>
+        </w:rPr>
+        <w:t>github.com/mmeents/</w:t>
+      </w:r>
+      <w:r>
+        <w:rPr>
+          <w:rFonts w:ascii="Arial" w:eastAsia="Arial" w:hAnsi="Arial" w:cs="Arial"/>
+          <w:color w:val="2E5BFF"/>
+        </w:rPr>
+        <w:t>Storytime</w:t>
       </w:r>
     </w:p>
     <w:p>

</xml_diff>